<commit_message>
Finalne zmiany dla PR
</commit_message>
<xml_diff>
--- a/Bartosz Malczewski_59552_Technologie internetowe_SKLEP_GITHUB.docx
+++ b/Bartosz Malczewski_59552_Technologie internetowe_SKLEP_GITHUB.docx
@@ -109,13 +109,8 @@
     </w:p>
     <w:p>
       <w:r>
-        <w:t xml:space="preserve">Visual Studio </w:t>
-      </w:r>
-      <w:proofErr w:type="spellStart"/>
-      <w:r>
-        <w:t>Code</w:t>
-      </w:r>
-      <w:proofErr w:type="spellEnd"/>
+        <w:t>Visual Studio Code</w:t>
+      </w:r>
     </w:p>
     <w:p>
       <w:pPr>
@@ -495,18 +490,191 @@
     <w:p>
       <w:pPr>
         <w:rPr>
+          <w:b/>
+          <w:bCs/>
+          <w:sz w:val="32"/>
+          <w:szCs w:val="32"/>
+        </w:rPr>
+      </w:pPr>
+    </w:p>
+    <w:p>
+      <w:pPr>
+        <w:rPr>
+          <w:b/>
+          <w:bCs/>
+          <w:sz w:val="32"/>
+          <w:szCs w:val="32"/>
+        </w:rPr>
+      </w:pPr>
+      <w:r>
+        <w:rPr>
+          <w:b/>
+          <w:bCs/>
+          <w:sz w:val="32"/>
+          <w:szCs w:val="32"/>
+        </w:rPr>
+        <w:t>Git</w:t>
+      </w:r>
+    </w:p>
+    <w:p>
+      <w:pPr>
+        <w:rPr>
+          <w:b/>
+          <w:bCs/>
+          <w:sz w:val="32"/>
+          <w:szCs w:val="32"/>
+        </w:rPr>
+      </w:pPr>
+      <w:r>
+        <w:rPr>
+          <w:b/>
+          <w:bCs/>
+          <w:sz w:val="32"/>
+          <w:szCs w:val="32"/>
+        </w:rPr>
+        <w:drawing>
+          <wp:inline distT="0" distB="0" distL="0" distR="0" wp14:anchorId="4AE16040" wp14:editId="339E5E58">
+            <wp:extent cx="5760720" cy="2633345"/>
+            <wp:effectExtent l="0" t="0" r="0" b="0"/>
+            <wp:docPr id="1252335461" name="Obraz 1"/>
+            <wp:cNvGraphicFramePr>
+              <a:graphicFrameLocks xmlns:a="http://schemas.openxmlformats.org/drawingml/2006/main" noChangeAspect="1"/>
+            </wp:cNvGraphicFramePr>
+            <a:graphic xmlns:a="http://schemas.openxmlformats.org/drawingml/2006/main">
+              <a:graphicData uri="http://schemas.openxmlformats.org/drawingml/2006/picture">
+                <pic:pic xmlns:pic="http://schemas.openxmlformats.org/drawingml/2006/picture">
+                  <pic:nvPicPr>
+                    <pic:cNvPr id="1252335461" name=""/>
+                    <pic:cNvPicPr/>
+                  </pic:nvPicPr>
+                  <pic:blipFill>
+                    <a:blip r:embed="rId13"/>
+                    <a:stretch>
+                      <a:fillRect/>
+                    </a:stretch>
+                  </pic:blipFill>
+                  <pic:spPr>
+                    <a:xfrm>
+                      <a:off x="0" y="0"/>
+                      <a:ext cx="5760720" cy="2633345"/>
+                    </a:xfrm>
+                    <a:prstGeom prst="rect">
+                      <a:avLst/>
+                    </a:prstGeom>
+                  </pic:spPr>
+                </pic:pic>
+              </a:graphicData>
+            </a:graphic>
+          </wp:inline>
+        </w:drawing>
+      </w:r>
+    </w:p>
+    <w:p>
+      <w:pPr>
+        <w:rPr>
           <w:sz w:val="24"/>
           <w:szCs w:val="24"/>
         </w:rPr>
       </w:pPr>
-    </w:p>
-    <w:p>
-      <w:pPr>
+      <w:r>
         <w:rPr>
           <w:sz w:val="24"/>
           <w:szCs w:val="24"/>
         </w:rPr>
-      </w:pPr>
+        <w:lastRenderedPageBreak/>
+        <w:drawing>
+          <wp:inline distT="0" distB="0" distL="0" distR="0" wp14:anchorId="16AA4EF6" wp14:editId="434E75B0">
+            <wp:extent cx="5760720" cy="2883535"/>
+            <wp:effectExtent l="0" t="0" r="0" b="0"/>
+            <wp:docPr id="1947835881" name="Obraz 1"/>
+            <wp:cNvGraphicFramePr>
+              <a:graphicFrameLocks xmlns:a="http://schemas.openxmlformats.org/drawingml/2006/main" noChangeAspect="1"/>
+            </wp:cNvGraphicFramePr>
+            <a:graphic xmlns:a="http://schemas.openxmlformats.org/drawingml/2006/main">
+              <a:graphicData uri="http://schemas.openxmlformats.org/drawingml/2006/picture">
+                <pic:pic xmlns:pic="http://schemas.openxmlformats.org/drawingml/2006/picture">
+                  <pic:nvPicPr>
+                    <pic:cNvPr id="1947835881" name=""/>
+                    <pic:cNvPicPr/>
+                  </pic:nvPicPr>
+                  <pic:blipFill>
+                    <a:blip r:embed="rId14"/>
+                    <a:stretch>
+                      <a:fillRect/>
+                    </a:stretch>
+                  </pic:blipFill>
+                  <pic:spPr>
+                    <a:xfrm>
+                      <a:off x="0" y="0"/>
+                      <a:ext cx="5760720" cy="2883535"/>
+                    </a:xfrm>
+                    <a:prstGeom prst="rect">
+                      <a:avLst/>
+                    </a:prstGeom>
+                  </pic:spPr>
+                </pic:pic>
+              </a:graphicData>
+            </a:graphic>
+          </wp:inline>
+        </w:drawing>
+      </w:r>
+    </w:p>
+    <w:p>
+      <w:pPr>
+        <w:rPr>
+          <w:sz w:val="24"/>
+          <w:szCs w:val="24"/>
+        </w:rPr>
+      </w:pPr>
+    </w:p>
+    <w:p>
+      <w:pPr>
+        <w:rPr>
+          <w:sz w:val="24"/>
+          <w:szCs w:val="24"/>
+        </w:rPr>
+      </w:pPr>
+      <w:r>
+        <w:rPr>
+          <w:sz w:val="24"/>
+          <w:szCs w:val="24"/>
+        </w:rPr>
+        <w:drawing>
+          <wp:inline distT="0" distB="0" distL="0" distR="0" wp14:anchorId="44D7B75D" wp14:editId="55FEE2EA">
+            <wp:extent cx="5760720" cy="2286635"/>
+            <wp:effectExtent l="0" t="0" r="0" b="0"/>
+            <wp:docPr id="151530786" name="Obraz 1"/>
+            <wp:cNvGraphicFramePr>
+              <a:graphicFrameLocks xmlns:a="http://schemas.openxmlformats.org/drawingml/2006/main" noChangeAspect="1"/>
+            </wp:cNvGraphicFramePr>
+            <a:graphic xmlns:a="http://schemas.openxmlformats.org/drawingml/2006/main">
+              <a:graphicData uri="http://schemas.openxmlformats.org/drawingml/2006/picture">
+                <pic:pic xmlns:pic="http://schemas.openxmlformats.org/drawingml/2006/picture">
+                  <pic:nvPicPr>
+                    <pic:cNvPr id="151530786" name=""/>
+                    <pic:cNvPicPr/>
+                  </pic:nvPicPr>
+                  <pic:blipFill>
+                    <a:blip r:embed="rId15"/>
+                    <a:stretch>
+                      <a:fillRect/>
+                    </a:stretch>
+                  </pic:blipFill>
+                  <pic:spPr>
+                    <a:xfrm>
+                      <a:off x="0" y="0"/>
+                      <a:ext cx="5760720" cy="2286635"/>
+                    </a:xfrm>
+                    <a:prstGeom prst="rect">
+                      <a:avLst/>
+                    </a:prstGeom>
+                  </pic:spPr>
+                </pic:pic>
+              </a:graphicData>
+            </a:graphic>
+          </wp:inline>
+        </w:drawing>
+      </w:r>
     </w:p>
     <w:p/>
     <w:p>

</xml_diff>